<commit_message>
Fix MODELOS precip ficha visibility: render via iframe with height.
st.html could mount the Word ficha at zero height so the table looked empty; also refresh the precip docx media.

Co-authored-by: Cursor <cursoragent@cursor.com>
</commit_message>
<xml_diff>
--- a/Fichas/PI EXCESO DE PRECIPITACION.docx
+++ b/Fichas/PI EXCESO DE PRECIPITACION.docx
@@ -1905,13 +1905,13 @@
     <w:p/>
     <w:p/>
     <w:p/>
+    <w:p/>
     <w:p>
       <w:r>
-        <w:lastRenderedPageBreak/>
         <w:drawing>
-          <wp:inline distT="0" distB="0" distL="0" distR="0" wp14:anchorId="52EA79D2" wp14:editId="0E6379E2">
-            <wp:extent cx="5400040" cy="2935605"/>
-            <wp:effectExtent l="0" t="0" r="0" b="0"/>
+          <wp:inline distT="0" distB="0" distL="0" distR="0" wp14:anchorId="1BD57460" wp14:editId="1D494486">
+            <wp:extent cx="5400040" cy="1612265"/>
+            <wp:effectExtent l="0" t="0" r="0" b="6985"/>
             <wp:docPr id="1" name="Imagen 1"/>
             <wp:cNvGraphicFramePr>
               <a:graphicFrameLocks xmlns:a="http://schemas.openxmlformats.org/drawingml/2006/main" noChangeAspect="1"/>
@@ -1932,7 +1932,7 @@
                   <pic:spPr>
                     <a:xfrm>
                       <a:off x="0" y="0"/>
-                      <a:ext cx="5400040" cy="2935605"/>
+                      <a:ext cx="5400040" cy="1612265"/>
                     </a:xfrm>
                     <a:prstGeom prst="rect">
                       <a:avLst/>
@@ -1945,7 +1945,6 @@
         </w:drawing>
       </w:r>
     </w:p>
-    <w:p/>
     <w:p/>
     <w:p/>
     <w:p/>

</xml_diff>